<commit_message>
Expand roster and debate methodology
</commit_message>
<xml_diff>
--- a/docs/What_Would_Win_Product_Plan.docx
+++ b/docs/What_Would_Win_Product_Plan.docx
@@ -141,7 +141,7 @@
                 <w:color w:val="1F2937"/>
                 <w:sz w:val="17"/>
               </w:rPr>
-              <w:t>0.1 — working prototype handoff</w:t>
+              <w:t>0.2 — user-test candidate</w:t>
             </w:r>
           </w:p>
         </w:tc>
@@ -200,7 +200,7 @@
                 <w:color w:val="1F2937"/>
                 <w:sz w:val="17"/>
               </w:rPr>
-              <w:t>17 July 2026</w:t>
+              <w:t>18 July 2026</w:t>
             </w:r>
           </w:p>
         </w:tc>
@@ -259,7 +259,7 @@
                 <w:color w:val="1F2937"/>
                 <w:sz w:val="17"/>
               </w:rPr>
-              <w:t>Sam · samfa12.com</w:t>
+              <w:t>Samfa12-tech · samfa12.com</w:t>
             </w:r>
           </w:p>
         </w:tc>
@@ -980,15 +980,15 @@
           <w:color w:val="1F2937"/>
           <w:sz w:val="17"/>
         </w:rPr>
-        <w:t>MVP-100</w:t>
-      </w:r>
-      <w:r>
-        <w:rPr>
-          <w:rFonts w:ascii="Arial" w:hAnsi="Arial" w:eastAsia="Arial"/>
-          <w:color w:val="1F2937"/>
-          <w:sz w:val="17"/>
-        </w:rPr>
-        <w:t xml:space="preserve"> database: 64 living animals, 8 extinct animals, 24 fantasy or mythological profiles and 4 generic human profiles;</w:t>
+        <w:t>134-profile</w:t>
+      </w:r>
+      <w:r>
+        <w:rPr>
+          <w:rFonts w:ascii="Arial" w:hAnsi="Arial" w:eastAsia="Arial"/>
+          <w:color w:val="1F2937"/>
+          <w:sz w:val="17"/>
+        </w:rPr>
+        <w:t xml:space="preserve"> database: 73 living animals, 20 extinct animals, 37 fantasy or mythological profiles (including 8 fixed cryptid interpretations) and 4 generic human profiles;</w:t>
       </w:r>
     </w:p>
     <w:p>
@@ -1014,7 +1014,7 @@
           <w:color w:val="1F2937"/>
           <w:sz w:val="17"/>
         </w:rPr>
-        <w:t>seven behavioural calibration scenarios and automated tests;</w:t>
+        <w:t>twelve behavioural calibration scenarios and automated tests;</w:t>
       </w:r>
     </w:p>
     <w:p>
@@ -2134,7 +2134,7 @@
                 <w:color w:val="1F2937"/>
                 <w:sz w:val="15"/>
               </w:rPr>
-              <w:t xml:space="preserve">Free viral web toy hosted by Sam on </w:t>
+              <w:t xml:space="preserve">Free viral web toy hosted by Samfa12-tech on </w:t>
             </w:r>
             <w:r>
               <w:rPr>
@@ -2615,7 +2615,7 @@
           <w:color w:val="1F2937"/>
           <w:sz w:val="17"/>
         </w:rPr>
-        <w:t>100 built-in profiles, grouped by living, extinct, fantasy and generic human.</w:t>
+        <w:t>134 built-in profiles, grouped by living, extinct, fantasy and generic human.</w:t>
       </w:r>
     </w:p>
     <w:p>
@@ -2902,7 +2902,7 @@
           <w:color w:val="1F2937"/>
           <w:sz w:val="17"/>
         </w:rPr>
-        <w:t>Persistent named custom creatures. The prototype's overrides already demonstrate base-profile modification and structured stat editing; saveable custom entries are the next feature.</w:t>
+        <w:t>Cloud-synced or publicly listed custom creatures. Named custom profiles are deliberately local-only unless the user explicitly exports or shares them.</w:t>
       </w:r>
     </w:p>
     <w:p>
@@ -6404,7 +6404,7 @@
           <w:color w:val="1F2937"/>
           <w:sz w:val="18"/>
         </w:rPr>
-        <w:t xml:space="preserve">The MVP-100 is selected for </w:t>
+        <w:t xml:space="preserve">The 134-profile roster is selected for </w:t>
       </w:r>
       <w:r>
         <w:rPr>
@@ -6434,7 +6434,7 @@
           <w:color w:val="1F2937"/>
           <w:sz w:val="17"/>
         </w:rPr>
-        <w:t>64 living animals covering megafauna, apex predators, packs, domestic animals, birds, aquatic specialists, venom, flight and swarms;</w:t>
+        <w:t>73 living animals covering megafauna, apex predators, packs, domestic animals, birds, aquatic specialists, venom, flight and swarms;</w:t>
       </w:r>
     </w:p>
     <w:p>
@@ -6447,7 +6447,7 @@
           <w:color w:val="1F2937"/>
           <w:sz w:val="17"/>
         </w:rPr>
-        <w:t>8 extinct animals covering iconic dinosaurs and Pleistocene megafauna;</w:t>
+        <w:t>20 extinct animals covering iconic dinosaurs, prehistoric crocodilians and Pleistocene megafauna;</w:t>
       </w:r>
     </w:p>
     <w:p>
@@ -6460,7 +6460,7 @@
           <w:color w:val="1F2937"/>
           <w:sz w:val="17"/>
         </w:rPr>
-        <w:t>24 generic or public-domain mythological creatures covering giants, dragons, regeneration, constructs, undead, magic and colossal aquatic profiles;</w:t>
+        <w:t>37 generic or public-domain fantasy/mythology profiles, including 8 fixed cryptid interpretations, covering giants, dragons, regeneration, constructs, undead, magic and colossal aquatic profiles;</w:t>
       </w:r>
     </w:p>
     <w:p>
@@ -6509,7 +6509,7 @@
           <w:color w:val="1F2937"/>
           <w:sz w:val="18"/>
         </w:rPr>
-        <w:t>Each real profile represents a large, healthy, combat-capable adult. It is not the species mean and not the largest anecdotal specimen. Where sexual dimorphism matters, the profile generally follows the larger or more combat-relevant adult form, but the current dataset does not yet store sex explicitly. This convention must remain visible in the interface and documentation.</w:t>
+        <w:t>Each real profile represents a large, healthy, combat-capable adult. It is not the species mean and not the largest anecdotal specimen. The scenario can declare specimen basis and sex for transparency, but these fields do not change coefficients unless the user also changes size or authored stats. Per-record provenance still needs explicit sex, life-stage, condition and taxon basis.</w:t>
       </w:r>
     </w:p>
     <w:p>
@@ -10548,7 +10548,7 @@
           <w:color w:val="1F2937"/>
           <w:sz w:val="17"/>
         </w:rPr>
-        <w:t>Initial compressed JS under 150 kB where practical; current build is roughly 84 kB gzip for JavaScript plus 4 kB gzip for CSS.</w:t>
+        <w:t>Initial compressed JS under 150 kB where practical; the 0.2 build is roughly 140 kB gzip for JavaScript plus 4.4 kB gzip for CSS, with raw CI ceilings of 575 kB JavaScript and 700 kB total deployable content.</w:t>
       </w:r>
     </w:p>
     <w:p>
@@ -11265,7 +11265,20 @@
           <w:color w:val="1F2937"/>
           <w:sz w:val="17"/>
         </w:rPr>
-        <w:t>seven matchup acceptance bands;</w:t>
+        <w:t>twelve matchup acceptance bands;</w:t>
+      </w:r>
+    </w:p>
+    <w:p>
+      <w:pPr>
+        <w:pStyle w:val="ListBullet"/>
+      </w:pPr>
+      <w:r>
+        <w:rPr>
+          <w:rFonts w:ascii="Arial" w:hAnsi="Arial" w:eastAsia="Arial"/>
+          <w:color w:val="1F2937"/>
+          <w:sz w:val="17"/>
+        </w:rPr>
+        <w:t>focused directional tests for mindset, win condition, knowledge, awareness, facing, water geometry, group doctrine, casualty tolerance, arena escape and disclosure-only specimen metadata;</w:t>
       </w:r>
     </w:p>
     <w:p>
@@ -11339,7 +11352,7 @@
           <w:color w:val="1F2937"/>
           <w:sz w:val="17"/>
         </w:rPr>
-        <w:t>strict versus functional versus magical scaling changes expected integrity and result direction;</w:t>
+        <w:t>browser-automated PNG export and file-content smoke tests;</w:t>
       </w:r>
     </w:p>
     <w:p>
@@ -11352,7 +11365,7 @@
           <w:color w:val="1F2937"/>
           <w:sz w:val="17"/>
         </w:rPr>
-        <w:t>long-distance ranged advantage and depleted-ammunition reversal;</w:t>
+        <w:t>property-based scenario/share-codec tests across valid field combinations;</w:t>
       </w:r>
     </w:p>
     <w:p>
@@ -11365,7 +11378,7 @@
           <w:color w:val="1F2937"/>
           <w:sz w:val="17"/>
         </w:rPr>
-        <w:t>flight access against a non-ranged ground group;</w:t>
+        <w:t>sensitivity and metamorphic tests for coefficient monotonicity and interaction bounds;</w:t>
       </w:r>
     </w:p>
     <w:p>
@@ -11378,7 +11391,7 @@
           <w:color w:val="1F2937"/>
           <w:sz w:val="17"/>
         </w:rPr>
-        <w:t>aquatic mismatch on deep-ocean terrain;</w:t>
+        <w:t>migration fixtures for every future model/data/share version change;</w:t>
       </w:r>
     </w:p>
     <w:p>
@@ -11391,7 +11404,7 @@
           <w:color w:val="1F2937"/>
           <w:sz w:val="17"/>
         </w:rPr>
-        <w:t>low coordination scaling worse than swarm/formation profiles;</w:t>
+        <w:t>manual NVDA/VoiceOver and physical Safari/iOS checks;</w:t>
       </w:r>
     </w:p>
     <w:p>
@@ -11404,59 +11417,7 @@
           <w:color w:val="1F2937"/>
           <w:sz w:val="17"/>
         </w:rPr>
-        <w:t>URL round-trip for every size method and advanced field;</w:t>
-      </w:r>
-    </w:p>
-    <w:p>
-      <w:pPr>
-        <w:pStyle w:val="ListBullet"/>
-      </w:pPr>
-      <w:r>
-        <w:rPr>
-          <w:rFonts w:ascii="Arial" w:hAnsi="Arial" w:eastAsia="Arial"/>
-          <w:color w:val="1F2937"/>
-          <w:sz w:val="17"/>
-        </w:rPr>
-        <w:t>localStorage corruption recovery;</w:t>
-      </w:r>
-    </w:p>
-    <w:p>
-      <w:pPr>
-        <w:pStyle w:val="ListBullet"/>
-      </w:pPr>
-      <w:r>
-        <w:rPr>
-          <w:rFonts w:ascii="Arial" w:hAnsi="Arial" w:eastAsia="Arial"/>
-          <w:color w:val="1F2937"/>
-          <w:sz w:val="17"/>
-        </w:rPr>
-        <w:t>PNG export smoke test;</w:t>
-      </w:r>
-    </w:p>
-    <w:p>
-      <w:pPr>
-        <w:pStyle w:val="ListBullet"/>
-      </w:pPr>
-      <w:r>
-        <w:rPr>
-          <w:rFonts w:ascii="Arial" w:hAnsi="Arial" w:eastAsia="Arial"/>
-          <w:color w:val="1F2937"/>
-          <w:sz w:val="17"/>
-        </w:rPr>
-        <w:t>keyboard and accessibility automation;</w:t>
-      </w:r>
-    </w:p>
-    <w:p>
-      <w:pPr>
-        <w:pStyle w:val="ListBullet"/>
-      </w:pPr>
-      <w:r>
-        <w:rPr>
-          <w:rFonts w:ascii="Arial" w:hAnsi="Arial" w:eastAsia="Arial"/>
-          <w:color w:val="1F2937"/>
-          <w:sz w:val="17"/>
-        </w:rPr>
-        <w:t xml:space="preserve">performance test at 15,000 trials and extreme </w:t>
+        <w:t xml:space="preserve">deployment smoke tests from the intended </w:t>
       </w:r>
       <w:r>
         <w:rPr>
@@ -11464,15 +11425,15 @@
           <w:color w:val="0B1220"/>
           <w:sz w:val="17"/>
         </w:rPr>
-        <w:t>log10(N)</w:t>
-      </w:r>
-      <w:r>
-        <w:rPr>
-          <w:rFonts w:ascii="Arial" w:hAnsi="Arial" w:eastAsia="Arial"/>
-          <w:color w:val="1F2937"/>
-          <w:sz w:val="17"/>
-        </w:rPr>
-        <w:t>.</w:t>
+        <w:t>samfa12.com</w:t>
+      </w:r>
+      <w:r>
+        <w:rPr>
+          <w:rFonts w:ascii="Arial" w:hAnsi="Arial" w:eastAsia="Arial"/>
+          <w:color w:val="1F2937"/>
+          <w:sz w:val="17"/>
+        </w:rPr>
+        <w:t xml:space="preserve"> subpath.</w:t>
       </w:r>
     </w:p>
     <w:p>
@@ -11759,7 +11720,7 @@
           <w:color w:val="1F2937"/>
           <w:sz w:val="18"/>
         </w:rPr>
-        <w:t>Static React demo, MVP-100 data, deterministic-plus-Monte-Carlo model, exports, history, documentation and calibration tests.</w:t>
+        <w:t>Static React demo, 134-profile data, deterministic-plus-Monte-Carlo model, exports, history, documentation and calibration tests.</w:t>
       </w:r>
     </w:p>
     <w:p>
@@ -11767,7 +11728,7 @@
         <w:pStyle w:val="Heading3"/>
       </w:pPr>
       <w:r>
-        <w:t>Phase 1 — trustworthy beta</w:t>
+        <w:t>Phase 1A — trustworthy-beta foundation (delivered in v0.2)</w:t>
       </w:r>
     </w:p>
     <w:p>
@@ -11780,7 +11741,7 @@
           <w:color w:val="1F2937"/>
           <w:sz w:val="17"/>
         </w:rPr>
-        <w:t>add model versioning to scenarios and exports;</w:t>
+        <w:t>versioned scenarios, exports, history and compact share links with migration;</w:t>
       </w:r>
     </w:p>
     <w:p>
@@ -11793,7 +11754,7 @@
           <w:color w:val="1F2937"/>
           <w:sz w:val="17"/>
         </w:rPr>
-        <w:t>introduce per-field provenance and data validation;</w:t>
+        <w:t>integrated schema validation and initial per-field provenance records;</w:t>
       </w:r>
     </w:p>
     <w:p>
@@ -11806,7 +11767,7 @@
           <w:color w:val="1F2937"/>
           <w:sz w:val="17"/>
         </w:rPr>
-        <w:t>add saveable custom profiles cloned from built-ins;</w:t>
+        <w:t>local named custom profiles cloned from built-ins, with import/export and reproducible sharing;</w:t>
       </w:r>
     </w:p>
     <w:p>
@@ -11819,7 +11780,7 @@
           <w:color w:val="1F2937"/>
           <w:sz w:val="17"/>
         </w:rPr>
-        <w:t>improve archetype-specific allometry and group exponents;</w:t>
+        <w:t>automated accessibility, browser, performance and build-size gates;</w:t>
       </w:r>
     </w:p>
     <w:p>
@@ -11832,7 +11793,7 @@
           <w:color w:val="1F2937"/>
           <w:sz w:val="17"/>
         </w:rPr>
-        <w:t>run accessibility and performance hardening;</w:t>
+        <w:t>visible methodology, assumptions and rules-of-engagement controls;</w:t>
       </w:r>
     </w:p>
     <w:p>
@@ -11845,7 +11806,15 @@
           <w:color w:val="1F2937"/>
           <w:sz w:val="17"/>
         </w:rPr>
-        <w:t>add Open Graph result preview generation;</w:t>
+        <w:t>134 built-in profiles and twelve calibration fixtures.</w:t>
+      </w:r>
+    </w:p>
+    <w:p>
+      <w:pPr>
+        <w:pStyle w:val="Heading3"/>
+      </w:pPr>
+      <w:r>
+        <w:t>Phase 1B — trustworthy beta (next)</w:t>
       </w:r>
     </w:p>
     <w:p>
@@ -11858,7 +11827,59 @@
           <w:color w:val="1F2937"/>
           <w:sz w:val="17"/>
         </w:rPr>
-        <w:t>add a methodology/about view.</w:t>
+        <w:t>complete expert-reviewed per-field provenance, licences and cultural-sensitivity review;</w:t>
+      </w:r>
+    </w:p>
+    <w:p>
+      <w:pPr>
+        <w:pStyle w:val="ListBullet"/>
+      </w:pPr>
+      <w:r>
+        <w:rPr>
+          <w:rFonts w:ascii="Arial" w:hAnsi="Arial" w:eastAsia="Arial"/>
+          <w:color w:val="1F2937"/>
+          <w:sz w:val="17"/>
+        </w:rPr>
+        <w:t>improve archetype-specific allometry, contact saturation and group exponents;</w:t>
+      </w:r>
+    </w:p>
+    <w:p>
+      <w:pPr>
+        <w:pStyle w:val="ListBullet"/>
+      </w:pPr>
+      <w:r>
+        <w:rPr>
+          <w:rFonts w:ascii="Arial" w:hAnsi="Arial" w:eastAsia="Arial"/>
+          <w:color w:val="1F2937"/>
+          <w:sz w:val="17"/>
+        </w:rPr>
+        <w:t>run manual assistive-technology and physical-device testing;</w:t>
+      </w:r>
+    </w:p>
+    <w:p>
+      <w:pPr>
+        <w:pStyle w:val="ListBullet"/>
+      </w:pPr>
+      <w:r>
+        <w:rPr>
+          <w:rFonts w:ascii="Arial" w:hAnsi="Arial" w:eastAsia="Arial"/>
+          <w:color w:val="1F2937"/>
+          <w:sz w:val="17"/>
+        </w:rPr>
+        <w:t>add Open Graph result preview generation and public privacy/methodology pages;</w:t>
+      </w:r>
+    </w:p>
+    <w:p>
+      <w:pPr>
+        <w:pStyle w:val="ListBullet"/>
+      </w:pPr>
+      <w:r>
+        <w:rPr>
+          <w:rFonts w:ascii="Arial" w:hAnsi="Arial" w:eastAsia="Arial"/>
+          <w:color w:val="1F2937"/>
+          <w:sz w:val="17"/>
+        </w:rPr>
+        <w:t>deploy to a staging subpath and collect structured user-test feedback.</w:t>
       </w:r>
     </w:p>
     <w:p>
@@ -12106,7 +12127,29 @@
         <w:pStyle w:val="Heading3"/>
       </w:pPr>
       <w:r>
-        <w:t>P0 — harden the delivered prototype</w:t>
+        <w:t>Delivered in v0.2</w:t>
+      </w:r>
+    </w:p>
+    <w:p>
+      <w:pPr>
+        <w:keepLines w:val="0"/>
+        <w:spacing w:after="80" w:before="0" w:line="259" w:lineRule="auto"/>
+      </w:pPr>
+      <w:r>
+        <w:rPr>
+          <w:rFonts w:ascii="Arial" w:hAnsi="Arial" w:eastAsia="Arial"/>
+          <w:color w:val="1F2937"/>
+          <w:sz w:val="18"/>
+        </w:rPr>
+        <w:t>Model/data/share versioning, integrated schemas, compact and migrated links, local named custom profiles, calibrated methodology controls, browser/accessibility automation, performance budgets, public-release hardening and a coefficient changelog are complete and regression-tested.</w:t>
+      </w:r>
+    </w:p>
+    <w:p>
+      <w:pPr>
+        <w:pStyle w:val="Heading3"/>
+      </w:pPr>
+      <w:r>
+        <w:t>P0 — user-test and deployment preparation</w:t>
       </w:r>
     </w:p>
     <w:p>
@@ -12120,7 +12163,21 @@
           <w:color w:val="1F2937"/>
           <w:sz w:val="17"/>
         </w:rPr>
-        <w:t xml:space="preserve">1. Add </w:t>
+        <w:t>1. Run manual exploratory tests, NVDA/VoiceOver checks and physical Safari/iOS tests.</w:t>
+      </w:r>
+    </w:p>
+    <w:p>
+      <w:pPr>
+        <w:spacing w:after="40"/>
+        <w:ind w:left="312" w:hanging="181"/>
+      </w:pPr>
+      <w:r>
+        <w:rPr>
+          <w:rFonts w:ascii="Arial" w:hAnsi="Arial" w:eastAsia="Arial"/>
+          <w:color w:val="1F2937"/>
+          <w:sz w:val="17"/>
+        </w:rPr>
+        <w:t xml:space="preserve">2. Validate the built app from the intended </w:t>
       </w:r>
       <w:r>
         <w:rPr>
@@ -12128,31 +12185,15 @@
           <w:color w:val="0B1220"/>
           <w:sz w:val="17"/>
         </w:rPr>
-        <w:t>MODEL_VERSION</w:t>
-      </w:r>
-      <w:r>
-        <w:rPr>
-          <w:rFonts w:ascii="Arial" w:hAnsi="Arial" w:eastAsia="Arial"/>
-          <w:color w:val="1F2937"/>
-          <w:sz w:val="17"/>
-        </w:rPr>
-        <w:t xml:space="preserve"> and </w:t>
-      </w:r>
-      <w:r>
-        <w:rPr>
-          <w:rFonts w:ascii="Courier New" w:hAnsi="Courier New" w:eastAsia="Courier New"/>
-          <w:color w:val="0B1220"/>
-          <w:sz w:val="17"/>
-        </w:rPr>
-        <w:t>DATA_VERSION</w:t>
-      </w:r>
-      <w:r>
-        <w:rPr>
-          <w:rFonts w:ascii="Arial" w:hAnsi="Arial" w:eastAsia="Arial"/>
-          <w:color w:val="1F2937"/>
-          <w:sz w:val="17"/>
-        </w:rPr>
-        <w:t xml:space="preserve"> constants to exported results and share URLs.</w:t>
+        <w:t>samfa12.com</w:t>
+      </w:r>
+      <w:r>
+        <w:rPr>
+          <w:rFonts w:ascii="Arial" w:hAnsi="Arial" w:eastAsia="Arial"/>
+          <w:color w:val="1F2937"/>
+          <w:sz w:val="17"/>
+        </w:rPr>
+        <w:t xml:space="preserve"> staging subpath.</w:t>
       </w:r>
     </w:p>
     <w:p>
@@ -12166,7 +12207,7 @@
           <w:color w:val="1F2937"/>
           <w:sz w:val="17"/>
         </w:rPr>
-        <w:t>2. Add JSON Schema validation during data generation and tests.</w:t>
+        <w:t>3. Test PNG and JSON downloads on representative mobile and desktop devices.</w:t>
       </w:r>
     </w:p>
     <w:p>
@@ -12180,7 +12221,7 @@
           <w:color w:val="1F2937"/>
           <w:sz w:val="17"/>
         </w:rPr>
-        <w:t>3. Add URL codec round-trip tests and graceful handling of oversized/corrupt query strings.</w:t>
+        <w:t>4. Add privacy, methodology and contact/reporting pages plus Open Graph metadata.</w:t>
       </w:r>
     </w:p>
     <w:p>
@@ -12194,7 +12235,7 @@
           <w:color w:val="1F2937"/>
           <w:sz w:val="17"/>
         </w:rPr>
-        <w:t>4. Add unit tests for each scaling law, environment modifier, flight/range access and ammunition.</w:t>
+        <w:t>5. Complete data-licence review and cultural-sensitivity review for cryptid composites.</w:t>
       </w:r>
     </w:p>
     <w:p>
@@ -12208,229 +12249,7 @@
           <w:color w:val="1F2937"/>
           <w:sz w:val="17"/>
         </w:rPr>
-        <w:t>5. Replace manual HTML canvas line wrapping with a tested export-card component or robust text fitting.</w:t>
-      </w:r>
-    </w:p>
-    <w:p>
-      <w:pPr>
-        <w:spacing w:after="40"/>
-        <w:ind w:left="312" w:hanging="181"/>
-      </w:pPr>
-      <w:r>
-        <w:rPr>
-          <w:rFonts w:ascii="Arial" w:hAnsi="Arial" w:eastAsia="Arial"/>
-          <w:color w:val="1F2937"/>
-          <w:sz w:val="17"/>
-        </w:rPr>
-        <w:t>6. Add accessible focus styles, skip link and automated axe checks.</w:t>
-      </w:r>
-    </w:p>
-    <w:p>
-      <w:pPr>
-        <w:spacing w:after="40"/>
-        <w:ind w:left="312" w:hanging="181"/>
-      </w:pPr>
-      <w:r>
-        <w:rPr>
-          <w:rFonts w:ascii="Arial" w:hAnsi="Arial" w:eastAsia="Arial"/>
-          <w:color w:val="1F2937"/>
-          <w:sz w:val="17"/>
-        </w:rPr>
-        <w:t>7. Fix any browser-compatibility issues found in Safari iOS and Firefox.</w:t>
-      </w:r>
-    </w:p>
-    <w:p>
-      <w:pPr>
-        <w:spacing w:after="40"/>
-        <w:ind w:left="312" w:hanging="181"/>
-      </w:pPr>
-      <w:r>
-        <w:rPr>
-          <w:rFonts w:ascii="Arial" w:hAnsi="Arial" w:eastAsia="Arial"/>
-          <w:color w:val="1F2937"/>
-          <w:sz w:val="17"/>
-        </w:rPr>
-        <w:t>8. Add a build-size and simulation-duration check to CI.</w:t>
-      </w:r>
-    </w:p>
-    <w:p>
-      <w:pPr>
-        <w:spacing w:after="40"/>
-        <w:ind w:left="312" w:hanging="181"/>
-      </w:pPr>
-      <w:r>
-        <w:rPr>
-          <w:rFonts w:ascii="Arial" w:hAnsi="Arial" w:eastAsia="Arial"/>
-          <w:color w:val="1F2937"/>
-          <w:sz w:val="17"/>
-        </w:rPr>
-        <w:t>9. Add an about/methodology panel containing the critical disclaimer and model version.</w:t>
-      </w:r>
-    </w:p>
-    <w:p>
-      <w:pPr>
-        <w:spacing w:after="40"/>
-        <w:ind w:left="312" w:hanging="181"/>
-      </w:pPr>
-      <w:r>
-        <w:rPr>
-          <w:rFonts w:ascii="Arial" w:hAnsi="Arial" w:eastAsia="Arial"/>
-          <w:color w:val="1F2937"/>
-          <w:sz w:val="17"/>
-        </w:rPr>
-        <w:t>10. Establish a changelog for coefficient changes.</w:t>
-      </w:r>
-    </w:p>
-    <w:p>
-      <w:pPr>
-        <w:pStyle w:val="Heading3"/>
-      </w:pPr>
-      <w:r>
-        <w:t>P1 — custom profile builder</w:t>
-      </w:r>
-    </w:p>
-    <w:p>
-      <w:pPr>
-        <w:spacing w:after="40"/>
-        <w:ind w:left="312" w:hanging="181"/>
-      </w:pPr>
-      <w:r>
-        <w:rPr>
-          <w:rFonts w:ascii="Arial" w:hAnsi="Arial" w:eastAsia="Arial"/>
-          <w:color w:val="1F2937"/>
-          <w:sz w:val="17"/>
-        </w:rPr>
-        <w:t xml:space="preserve">1. Add a </w:t>
-      </w:r>
-      <w:r>
-        <w:rPr>
-          <w:rFonts w:ascii="Courier New" w:hAnsi="Courier New" w:eastAsia="Courier New"/>
-          <w:color w:val="0B1220"/>
-          <w:sz w:val="17"/>
-        </w:rPr>
-        <w:t>CustomCreature</w:t>
-      </w:r>
-      <w:r>
-        <w:rPr>
-          <w:rFonts w:ascii="Arial" w:hAnsi="Arial" w:eastAsia="Arial"/>
-          <w:color w:val="1F2937"/>
-          <w:sz w:val="17"/>
-        </w:rPr>
-        <w:t xml:space="preserve"> type compatible with the base schema and a </w:t>
-      </w:r>
-      <w:r>
-        <w:rPr>
-          <w:rFonts w:ascii="Courier New" w:hAnsi="Courier New" w:eastAsia="Courier New"/>
-          <w:color w:val="0B1220"/>
-          <w:sz w:val="17"/>
-        </w:rPr>
-        <w:t>custom:</w:t>
-      </w:r>
-      <w:r>
-        <w:rPr>
-          <w:rFonts w:ascii="Arial" w:hAnsi="Arial" w:eastAsia="Arial"/>
-          <w:color w:val="1F2937"/>
-          <w:sz w:val="17"/>
-        </w:rPr>
-        <w:t xml:space="preserve"> ID namespace.</w:t>
-      </w:r>
-    </w:p>
-    <w:p>
-      <w:pPr>
-        <w:spacing w:after="40"/>
-        <w:ind w:left="312" w:hanging="181"/>
-      </w:pPr>
-      <w:r>
-        <w:rPr>
-          <w:rFonts w:ascii="Arial" w:hAnsi="Arial" w:eastAsia="Arial"/>
-          <w:color w:val="1F2937"/>
-          <w:sz w:val="17"/>
-        </w:rPr>
-        <w:t>2. Implement “Clone selected profile.”</w:t>
-      </w:r>
-    </w:p>
-    <w:p>
-      <w:pPr>
-        <w:spacing w:after="40"/>
-        <w:ind w:left="312" w:hanging="181"/>
-      </w:pPr>
-      <w:r>
-        <w:rPr>
-          <w:rFonts w:ascii="Arial" w:hAnsi="Arial" w:eastAsia="Arial"/>
-          <w:color w:val="1F2937"/>
-          <w:sz w:val="17"/>
-        </w:rPr>
-        <w:t>3. Build structured physical, capability, attack-mode, trait and normalized-stat editing.</w:t>
-      </w:r>
-    </w:p>
-    <w:p>
-      <w:pPr>
-        <w:spacing w:after="40"/>
-        <w:ind w:left="312" w:hanging="181"/>
-      </w:pPr>
-      <w:r>
-        <w:rPr>
-          <w:rFonts w:ascii="Arial" w:hAnsi="Arial" w:eastAsia="Arial"/>
-          <w:color w:val="1F2937"/>
-          <w:sz w:val="17"/>
-        </w:rPr>
-        <w:t>4. Validate ranges and flag inconsistent combinations rather than silently changing them.</w:t>
-      </w:r>
-    </w:p>
-    <w:p>
-      <w:pPr>
-        <w:spacing w:after="40"/>
-        <w:ind w:left="312" w:hanging="181"/>
-      </w:pPr>
-      <w:r>
-        <w:rPr>
-          <w:rFonts w:ascii="Arial" w:hAnsi="Arial" w:eastAsia="Arial"/>
-          <w:color w:val="1F2937"/>
-          <w:sz w:val="17"/>
-        </w:rPr>
-        <w:t>5. Save custom profiles in versioned localStorage.</w:t>
-      </w:r>
-    </w:p>
-    <w:p>
-      <w:pPr>
-        <w:spacing w:after="40"/>
-        <w:ind w:left="312" w:hanging="181"/>
-      </w:pPr>
-      <w:r>
-        <w:rPr>
-          <w:rFonts w:ascii="Arial" w:hAnsi="Arial" w:eastAsia="Arial"/>
-          <w:color w:val="1F2937"/>
-          <w:sz w:val="17"/>
-        </w:rPr>
-        <w:t>6. Include referenced custom profiles inside shared scenario payloads.</w:t>
-      </w:r>
-    </w:p>
-    <w:p>
-      <w:pPr>
-        <w:spacing w:after="40"/>
-        <w:ind w:left="312" w:hanging="181"/>
-      </w:pPr>
-      <w:r>
-        <w:rPr>
-          <w:rFonts w:ascii="Arial" w:hAnsi="Arial" w:eastAsia="Arial"/>
-          <w:color w:val="1F2937"/>
-          <w:sz w:val="17"/>
-        </w:rPr>
-        <w:t>7. Add JSON import/export and delete/duplicate controls.</w:t>
-      </w:r>
-    </w:p>
-    <w:p>
-      <w:pPr>
-        <w:spacing w:after="40"/>
-        <w:ind w:left="312" w:hanging="181"/>
-      </w:pPr>
-      <w:r>
-        <w:rPr>
-          <w:rFonts w:ascii="Arial" w:hAnsi="Arial" w:eastAsia="Arial"/>
-          <w:color w:val="1F2937"/>
-          <w:sz w:val="17"/>
-        </w:rPr>
-        <w:t>8. Make custom profiles private by default and display a “user-authored” confidence label.</w:t>
+        <w:t>6. Collect structured user feedback before changing calibration coefficients.</w:t>
       </w:r>
     </w:p>
     <w:p>
@@ -14176,7 +13995,7 @@
           <w:color w:val="1F2937"/>
           <w:sz w:val="18"/>
         </w:rPr>
-        <w:t>. A successful first iteration should:</w:t>
+        <w:t>. A successful user-test preparation iteration should:</w:t>
       </w:r>
     </w:p>
     <w:p>
@@ -14204,7 +14023,7 @@
           <w:color w:val="1F2937"/>
           <w:sz w:val="17"/>
         </w:rPr>
-        <w:t>2. add model/data versioning;</w:t>
+        <w:t>2. run manual exploratory, NVDA/VoiceOver and physical Safari/iOS checks;</w:t>
       </w:r>
     </w:p>
     <w:p>
@@ -14218,7 +14037,7 @@
           <w:color w:val="1F2937"/>
           <w:sz w:val="17"/>
         </w:rPr>
-        <w:t>3. add schema validation and at least five new interaction tests;</w:t>
+        <w:t>3. expand expert-reviewed per-field provenance and complete data/licence review;</w:t>
       </w:r>
     </w:p>
     <w:p>
@@ -14232,7 +14051,7 @@
           <w:color w:val="1F2937"/>
           <w:sz w:val="17"/>
         </w:rPr>
-        <w:t>4. implement the first saveable custom-profile slice or clearly document why a smaller prerequisite is required;</w:t>
+        <w:t>4. complete cultural-sensitivity review for living-tradition cryptid composites;</w:t>
       </w:r>
     </w:p>
     <w:p>
@@ -14246,7 +14065,23 @@
           <w:color w:val="1F2937"/>
           <w:sz w:val="17"/>
         </w:rPr>
-        <w:t>5. update this document and the changelog whenever the formula or data contract changes;</w:t>
+        <w:t xml:space="preserve">5. validate the production build from the intended </w:t>
+      </w:r>
+      <w:r>
+        <w:rPr>
+          <w:rFonts w:ascii="Courier New" w:hAnsi="Courier New" w:eastAsia="Courier New"/>
+          <w:color w:val="0B1220"/>
+          <w:sz w:val="17"/>
+        </w:rPr>
+        <w:t>samfa12.com</w:t>
+      </w:r>
+      <w:r>
+        <w:rPr>
+          <w:rFonts w:ascii="Arial" w:hAnsi="Arial" w:eastAsia="Arial"/>
+          <w:color w:val="1F2937"/>
+          <w:sz w:val="17"/>
+        </w:rPr>
+        <w:t xml:space="preserve"> subpath;</w:t>
       </w:r>
     </w:p>
     <w:p>
@@ -14260,39 +14095,7 @@
           <w:color w:val="1F2937"/>
           <w:sz w:val="17"/>
         </w:rPr>
-        <w:t xml:space="preserve">6. produce a deployable </w:t>
-      </w:r>
-      <w:r>
-        <w:rPr>
-          <w:rFonts w:ascii="Courier New" w:hAnsi="Courier New" w:eastAsia="Courier New"/>
-          <w:color w:val="0B1220"/>
-          <w:sz w:val="17"/>
-        </w:rPr>
-        <w:t>dist/</w:t>
-      </w:r>
-      <w:r>
-        <w:rPr>
-          <w:rFonts w:ascii="Arial" w:hAnsi="Arial" w:eastAsia="Arial"/>
-          <w:color w:val="1F2937"/>
-          <w:sz w:val="17"/>
-        </w:rPr>
-        <w:t xml:space="preserve"> directory for </w:t>
-      </w:r>
-      <w:r>
-        <w:rPr>
-          <w:rFonts w:ascii="Courier New" w:hAnsi="Courier New" w:eastAsia="Courier New"/>
-          <w:color w:val="0B1220"/>
-          <w:sz w:val="17"/>
-        </w:rPr>
-        <w:t>samfa12.com</w:t>
-      </w:r>
-      <w:r>
-        <w:rPr>
-          <w:rFonts w:ascii="Arial" w:hAnsi="Arial" w:eastAsia="Arial"/>
-          <w:color w:val="1F2937"/>
-          <w:sz w:val="17"/>
-        </w:rPr>
-        <w:t>.</w:t>
+        <w:t>6. collect structured feedback before changing calibration coefficients.</w:t>
       </w:r>
     </w:p>
     <w:p>
@@ -15907,7 +15710,7 @@
                 <w:color w:val="1F2937"/>
                 <w:sz w:val="15"/>
               </w:rPr>
-              <w:t>95.1%</w:t>
+              <w:t>95.0%</w:t>
             </w:r>
           </w:p>
         </w:tc>
@@ -16004,7 +15807,7 @@
                 <w:color w:val="1F2937"/>
                 <w:sz w:val="15"/>
               </w:rPr>
-              <w:t>88.5%</w:t>
+              <w:t>88.4%</w:t>
             </w:r>
           </w:p>
         </w:tc>
@@ -16197,7 +16000,7 @@
                 <w:color w:val="1F2937"/>
                 <w:sz w:val="15"/>
               </w:rPr>
-              <w:t>53.6%</w:t>
+              <w:t>54.6%</w:t>
             </w:r>
           </w:p>
         </w:tc>
@@ -16345,227 +16148,24 @@
           </w:p>
         </w:tc>
       </w:tr>
-    </w:tbl>
-    <w:p>
-      <w:pPr>
-        <w:spacing w:after="20"/>
-      </w:pPr>
-    </w:p>
-    <w:p>
-      <w:pPr>
-        <w:keepLines w:val="0"/>
-        <w:spacing w:after="80" w:before="0" w:line="259" w:lineRule="auto"/>
-      </w:pPr>
-      <w:r>
-        <w:rPr>
-          <w:rFonts w:ascii="Arial" w:hAnsi="Arial" w:eastAsia="Arial"/>
-          <w:color w:val="1F2937"/>
-          <w:sz w:val="18"/>
-        </w:rPr>
-        <w:t>A coefficient change should be assessed across the whole set. A change that makes one meme answer feel better but damages unrelated archetypes is a regression, not an improvement.</w:t>
-      </w:r>
-    </w:p>
-    <w:p>
-      <w:pPr>
-        <w:pStyle w:val="Heading2"/>
-      </w:pPr>
-      <w:r>
-        <w:t>Appendix C. Public-beta release checklist</w:t>
-      </w:r>
-    </w:p>
-    <w:p>
-      <w:pPr>
-        <w:pStyle w:val="ListBullet"/>
-      </w:pPr>
-      <w:r>
-        <w:rPr>
-          <w:rFonts w:ascii="Arial" w:hAnsi="Arial" w:eastAsia="Arial"/>
-          <w:color w:val="1F2937"/>
-          <w:sz w:val="17"/>
-        </w:rPr>
-        <w:t>Confirm code and data licences.</w:t>
-      </w:r>
-    </w:p>
-    <w:p>
-      <w:pPr>
-        <w:pStyle w:val="ListBullet"/>
-      </w:pPr>
-      <w:r>
-        <w:rPr>
-          <w:rFonts w:ascii="Arial" w:hAnsi="Arial" w:eastAsia="Arial"/>
-          <w:color w:val="1F2937"/>
-          <w:sz w:val="17"/>
-        </w:rPr>
-        <w:t>Add model and data version constants.</w:t>
-      </w:r>
-    </w:p>
-    <w:p>
-      <w:pPr>
-        <w:pStyle w:val="ListBullet"/>
-      </w:pPr>
-      <w:r>
-        <w:rPr>
-          <w:rFonts w:ascii="Arial" w:hAnsi="Arial" w:eastAsia="Arial"/>
-          <w:color w:val="1F2937"/>
-          <w:sz w:val="17"/>
-        </w:rPr>
-        <w:t>Run schema validation, tests, typecheck and production build.</w:t>
-      </w:r>
-    </w:p>
-    <w:p>
-      <w:pPr>
-        <w:pStyle w:val="ListBullet"/>
-      </w:pPr>
-      <w:r>
-        <w:rPr>
-          <w:rFonts w:ascii="Arial" w:hAnsi="Arial" w:eastAsia="Arial"/>
-          <w:color w:val="1F2937"/>
-          <w:sz w:val="17"/>
-        </w:rPr>
-        <w:t>Complete keyboard, axe, VoiceOver/NVDA, Safari iOS and Firefox checks.</w:t>
-      </w:r>
-    </w:p>
-    <w:p>
-      <w:pPr>
-        <w:pStyle w:val="ListBullet"/>
-      </w:pPr>
-      <w:r>
-        <w:rPr>
-          <w:rFonts w:ascii="Arial" w:hAnsi="Arial" w:eastAsia="Arial"/>
-          <w:color w:val="1F2937"/>
-          <w:sz w:val="17"/>
-        </w:rPr>
-        <w:t>Replace or strengthen provenance for the most frequently used profiles.</w:t>
-      </w:r>
-    </w:p>
-    <w:p>
-      <w:pPr>
-        <w:pStyle w:val="ListBullet"/>
-      </w:pPr>
-      <w:r>
-        <w:rPr>
-          <w:rFonts w:ascii="Arial" w:hAnsi="Arial" w:eastAsia="Arial"/>
-          <w:color w:val="1F2937"/>
-          <w:sz w:val="17"/>
-        </w:rPr>
-        <w:t>Add privacy, methodology and contact/reporting pages.</w:t>
-      </w:r>
-    </w:p>
-    <w:p>
-      <w:pPr>
-        <w:pStyle w:val="ListBullet"/>
-      </w:pPr>
-      <w:r>
-        <w:rPr>
-          <w:rFonts w:ascii="Arial" w:hAnsi="Arial" w:eastAsia="Arial"/>
-          <w:color w:val="1F2937"/>
-          <w:sz w:val="17"/>
-        </w:rPr>
-        <w:t>Add Open Graph metadata and a default social preview.</w:t>
-      </w:r>
-    </w:p>
-    <w:p>
-      <w:pPr>
-        <w:pStyle w:val="ListBullet"/>
-      </w:pPr>
-      <w:r>
-        <w:rPr>
-          <w:rFonts w:ascii="Arial" w:hAnsi="Arial" w:eastAsia="Arial"/>
-          <w:color w:val="1F2937"/>
-          <w:sz w:val="17"/>
-        </w:rPr>
-        <w:t xml:space="preserve">Configure HTTPS, compression, cache headers and monitoring on </w:t>
-      </w:r>
-      <w:r>
-        <w:rPr>
-          <w:rFonts w:ascii="Courier New" w:hAnsi="Courier New" w:eastAsia="Courier New"/>
-          <w:color w:val="0B1220"/>
-          <w:sz w:val="17"/>
-        </w:rPr>
-        <w:t>samfa12.com</w:t>
-      </w:r>
-      <w:r>
-        <w:rPr>
-          <w:rFonts w:ascii="Arial" w:hAnsi="Arial" w:eastAsia="Arial"/>
-          <w:color w:val="1F2937"/>
-          <w:sz w:val="17"/>
-        </w:rPr>
-        <w:t>.</w:t>
-      </w:r>
-    </w:p>
-    <w:p>
-      <w:pPr>
-        <w:pStyle w:val="ListBullet"/>
-      </w:pPr>
-      <w:r>
-        <w:rPr>
-          <w:rFonts w:ascii="Arial" w:hAnsi="Arial" w:eastAsia="Arial"/>
-          <w:color w:val="1F2937"/>
-          <w:sz w:val="17"/>
-        </w:rPr>
-        <w:t>Test copied share links from a clean browser profile.</w:t>
-      </w:r>
-    </w:p>
-    <w:p>
-      <w:pPr>
-        <w:pStyle w:val="ListBullet"/>
-      </w:pPr>
-      <w:r>
-        <w:rPr>
-          <w:rFonts w:ascii="Arial" w:hAnsi="Arial" w:eastAsia="Arial"/>
-          <w:color w:val="1F2937"/>
-          <w:sz w:val="17"/>
-        </w:rPr>
-        <w:t>Test PNG and JSON downloads on mobile and desktop.</w:t>
-      </w:r>
-    </w:p>
-    <w:p>
-      <w:pPr>
-        <w:pStyle w:val="ListBullet"/>
-      </w:pPr>
-      <w:r>
-        <w:rPr>
-          <w:rFonts w:ascii="Arial" w:hAnsi="Arial" w:eastAsia="Arial"/>
-          <w:color w:val="1F2937"/>
-          <w:sz w:val="17"/>
-        </w:rPr>
-        <w:t>Publish a changelog and retain the previous deploy for rollback.</w:t>
-      </w:r>
-    </w:p>
-    <w:p>
-      <w:pPr>
-        <w:pStyle w:val="Heading1"/>
-      </w:pPr>
-      <w:r>
-        <w:t>Handoff status</w:t>
-      </w:r>
-    </w:p>
-    <w:tbl>
-      <w:tblPr>
-        <w:tblW w:type="auto" w:w="0"/>
-        <w:tblLayout w:type="autofit"/>
-        <w:tblLook w:firstColumn="1" w:firstRow="1" w:lastColumn="0" w:lastRow="0" w:noHBand="0" w:noVBand="1" w:val="04A0"/>
-      </w:tblPr>
-      <w:tblGrid>
-        <w:gridCol w:w="9978"/>
-      </w:tblGrid>
       <w:tr>
         <w:tc>
           <w:tcPr>
-            <w:tcW w:type="dxa" w:w="9978"/>
-            <w:shd w:fill="EEF4EE"/>
+            <w:tcW w:type="dxa" w:w="3326"/>
+            <w:vAlign w:val="center"/>
+            <w:tcMar>
+              <w:top w:w="85" w:type="dxa"/>
+              <w:start w:w="105" w:type="dxa"/>
+              <w:bottom w:w="85" w:type="dxa"/>
+              <w:end w:w="105" w:type="dxa"/>
+            </w:tcMar>
             <w:tcBorders>
-              <w:top w:sz="4" w:val="single" w:color="5D8260" w:space="0"/>
-              <w:left w:sz="18" w:val="single" w:color="5D8260" w:space="0"/>
-              <w:bottom w:sz="4" w:val="single" w:color="5D8260" w:space="0"/>
-              <w:right w:sz="4" w:val="single" w:color="5D8260" w:space="0"/>
+              <w:top w:sz="4" w:val="single" w:color="CAD1DB" w:space="0"/>
+              <w:left w:sz="4" w:val="single" w:color="CAD1DB" w:space="0"/>
+              <w:bottom w:sz="4" w:val="single" w:color="CAD1DB" w:space="0"/>
+              <w:right w:sz="4" w:val="single" w:color="CAD1DB" w:space="0"/>
             </w:tcBorders>
-            <w:tcMar>
-              <w:top w:w="140" w:type="dxa"/>
-              <w:start w:w="180" w:type="dxa"/>
-              <w:bottom w:w="140" w:type="dxa"/>
-              <w:end w:w="180" w:type="dxa"/>
-            </w:tcMar>
+            <w:shd w:fill="F7F9FB"/>
           </w:tcPr>
           <w:p>
             <w:pPr>
@@ -16575,9 +16175,459 @@
               <w:rPr>
                 <w:rFonts w:ascii="Arial" w:hAnsi="Arial" w:eastAsia="Arial"/>
                 <w:color w:val="1F2937"/>
-                <w:sz w:val="18"/>
+                <w:sz w:val="15"/>
               </w:rPr>
-              <w:t>The supplied prototype builds successfully, passes its automated calibration suite and has been visually checked at desktop and mobile widths. The next high-value work is model/data versioning, schema validation in CI and saveable custom profiles.</w:t>
+              <w:t>Sperm whale vs 8 orcas in deep ocean</w:t>
+            </w:r>
+          </w:p>
+        </w:tc>
+        <w:tc>
+          <w:tcPr>
+            <w:tcW w:type="dxa" w:w="3326"/>
+            <w:vAlign w:val="center"/>
+            <w:tcMar>
+              <w:top w:w="85" w:type="dxa"/>
+              <w:start w:w="105" w:type="dxa"/>
+              <w:bottom w:w="85" w:type="dxa"/>
+              <w:end w:w="105" w:type="dxa"/>
+            </w:tcMar>
+            <w:tcBorders>
+              <w:top w:sz="4" w:val="single" w:color="CAD1DB" w:space="0"/>
+              <w:left w:sz="4" w:val="single" w:color="CAD1DB" w:space="0"/>
+              <w:bottom w:sz="4" w:val="single" w:color="CAD1DB" w:space="0"/>
+              <w:right w:sz="4" w:val="single" w:color="CAD1DB" w:space="0"/>
+            </w:tcBorders>
+            <w:shd w:fill="F7F9FB"/>
+          </w:tcPr>
+          <w:p>
+            <w:pPr>
+              <w:spacing w:after="0"/>
+            </w:pPr>
+            <w:r>
+              <w:rPr>
+                <w:rFonts w:ascii="Arial" w:hAnsi="Arial" w:eastAsia="Arial"/>
+                <w:color w:val="1F2937"/>
+                <w:sz w:val="15"/>
+              </w:rPr>
+              <w:t>22.4%</w:t>
+            </w:r>
+          </w:p>
+        </w:tc>
+        <w:tc>
+          <w:tcPr>
+            <w:tcW w:type="dxa" w:w="3326"/>
+            <w:vAlign w:val="center"/>
+            <w:tcMar>
+              <w:top w:w="85" w:type="dxa"/>
+              <w:start w:w="105" w:type="dxa"/>
+              <w:bottom w:w="85" w:type="dxa"/>
+              <w:end w:w="105" w:type="dxa"/>
+            </w:tcMar>
+            <w:tcBorders>
+              <w:top w:sz="4" w:val="single" w:color="CAD1DB" w:space="0"/>
+              <w:left w:sz="4" w:val="single" w:color="CAD1DB" w:space="0"/>
+              <w:bottom w:sz="4" w:val="single" w:color="CAD1DB" w:space="0"/>
+              <w:right w:sz="4" w:val="single" w:color="CAD1DB" w:space="0"/>
+            </w:tcBorders>
+            <w:shd w:fill="F7F9FB"/>
+          </w:tcPr>
+          <w:p>
+            <w:pPr>
+              <w:spacing w:after="0"/>
+            </w:pPr>
+            <w:r>
+              <w:rPr>
+                <w:rFonts w:ascii="Arial" w:hAnsi="Arial" w:eastAsia="Arial"/>
+                <w:color w:val="1F2937"/>
+                <w:sz w:val="15"/>
+              </w:rPr>
+              <w:t>Orca pod</w:t>
+            </w:r>
+          </w:p>
+        </w:tc>
+      </w:tr>
+      <w:tr>
+        <w:tc>
+          <w:tcPr>
+            <w:tcW w:type="dxa" w:w="3326"/>
+            <w:vAlign w:val="center"/>
+            <w:tcMar>
+              <w:top w:w="85" w:type="dxa"/>
+              <w:start w:w="105" w:type="dxa"/>
+              <w:bottom w:w="85" w:type="dxa"/>
+              <w:end w:w="105" w:type="dxa"/>
+            </w:tcMar>
+            <w:tcBorders>
+              <w:top w:sz="4" w:val="single" w:color="CAD1DB" w:space="0"/>
+              <w:left w:sz="4" w:val="single" w:color="CAD1DB" w:space="0"/>
+              <w:bottom w:sz="4" w:val="single" w:color="CAD1DB" w:space="0"/>
+              <w:right w:sz="4" w:val="single" w:color="CAD1DB" w:space="0"/>
+            </w:tcBorders>
+          </w:tcPr>
+          <w:p>
+            <w:pPr>
+              <w:spacing w:after="0"/>
+            </w:pPr>
+            <w:r>
+              <w:rPr>
+                <w:rFonts w:ascii="Arial" w:hAnsi="Arial" w:eastAsia="Arial"/>
+                <w:color w:val="1F2937"/>
+                <w:sz w:val="15"/>
+              </w:rPr>
+              <w:t>Spinosaurus vs 3 Nile crocodiles in a river</w:t>
+            </w:r>
+          </w:p>
+        </w:tc>
+        <w:tc>
+          <w:tcPr>
+            <w:tcW w:type="dxa" w:w="3326"/>
+            <w:vAlign w:val="center"/>
+            <w:tcMar>
+              <w:top w:w="85" w:type="dxa"/>
+              <w:start w:w="105" w:type="dxa"/>
+              <w:bottom w:w="85" w:type="dxa"/>
+              <w:end w:w="105" w:type="dxa"/>
+            </w:tcMar>
+            <w:tcBorders>
+              <w:top w:sz="4" w:val="single" w:color="CAD1DB" w:space="0"/>
+              <w:left w:sz="4" w:val="single" w:color="CAD1DB" w:space="0"/>
+              <w:bottom w:sz="4" w:val="single" w:color="CAD1DB" w:space="0"/>
+              <w:right w:sz="4" w:val="single" w:color="CAD1DB" w:space="0"/>
+            </w:tcBorders>
+          </w:tcPr>
+          <w:p>
+            <w:pPr>
+              <w:spacing w:after="0"/>
+            </w:pPr>
+            <w:r>
+              <w:rPr>
+                <w:rFonts w:ascii="Arial" w:hAnsi="Arial" w:eastAsia="Arial"/>
+                <w:color w:val="1F2937"/>
+                <w:sz w:val="15"/>
+              </w:rPr>
+              <w:t>80.8%</w:t>
+            </w:r>
+          </w:p>
+        </w:tc>
+        <w:tc>
+          <w:tcPr>
+            <w:tcW w:type="dxa" w:w="3326"/>
+            <w:vAlign w:val="center"/>
+            <w:tcMar>
+              <w:top w:w="85" w:type="dxa"/>
+              <w:start w:w="105" w:type="dxa"/>
+              <w:bottom w:w="85" w:type="dxa"/>
+              <w:end w:w="105" w:type="dxa"/>
+            </w:tcMar>
+            <w:tcBorders>
+              <w:top w:sz="4" w:val="single" w:color="CAD1DB" w:space="0"/>
+              <w:left w:sz="4" w:val="single" w:color="CAD1DB" w:space="0"/>
+              <w:bottom w:sz="4" w:val="single" w:color="CAD1DB" w:space="0"/>
+              <w:right w:sz="4" w:val="single" w:color="CAD1DB" w:space="0"/>
+            </w:tcBorders>
+          </w:tcPr>
+          <w:p>
+            <w:pPr>
+              <w:spacing w:after="0"/>
+            </w:pPr>
+            <w:r>
+              <w:rPr>
+                <w:rFonts w:ascii="Arial" w:hAnsi="Arial" w:eastAsia="Arial"/>
+                <w:color w:val="1F2937"/>
+                <w:sz w:val="15"/>
+              </w:rPr>
+              <w:t>Spinosaurus</w:t>
+            </w:r>
+          </w:p>
+        </w:tc>
+      </w:tr>
+      <w:tr>
+        <w:tc>
+          <w:tcPr>
+            <w:tcW w:type="dxa" w:w="3326"/>
+            <w:vAlign w:val="center"/>
+            <w:tcMar>
+              <w:top w:w="85" w:type="dxa"/>
+              <w:start w:w="105" w:type="dxa"/>
+              <w:bottom w:w="85" w:type="dxa"/>
+              <w:end w:w="105" w:type="dxa"/>
+            </w:tcMar>
+            <w:tcBorders>
+              <w:top w:sz="4" w:val="single" w:color="CAD1DB" w:space="0"/>
+              <w:left w:sz="4" w:val="single" w:color="CAD1DB" w:space="0"/>
+              <w:bottom w:sz="4" w:val="single" w:color="CAD1DB" w:space="0"/>
+              <w:right w:sz="4" w:val="single" w:color="CAD1DB" w:space="0"/>
+            </w:tcBorders>
+            <w:shd w:fill="F7F9FB"/>
+          </w:tcPr>
+          <w:p>
+            <w:pPr>
+              <w:spacing w:after="0"/>
+            </w:pPr>
+            <w:r>
+              <w:rPr>
+                <w:rFonts w:ascii="Arial" w:hAnsi="Arial" w:eastAsia="Arial"/>
+                <w:color w:val="1F2937"/>
+                <w:sz w:val="15"/>
+              </w:rPr>
+              <w:t>Fixed-model Bigfoot vs 10 unarmed adults</w:t>
+            </w:r>
+          </w:p>
+        </w:tc>
+        <w:tc>
+          <w:tcPr>
+            <w:tcW w:type="dxa" w:w="3326"/>
+            <w:vAlign w:val="center"/>
+            <w:tcMar>
+              <w:top w:w="85" w:type="dxa"/>
+              <w:start w:w="105" w:type="dxa"/>
+              <w:bottom w:w="85" w:type="dxa"/>
+              <w:end w:w="105" w:type="dxa"/>
+            </w:tcMar>
+            <w:tcBorders>
+              <w:top w:sz="4" w:val="single" w:color="CAD1DB" w:space="0"/>
+              <w:left w:sz="4" w:val="single" w:color="CAD1DB" w:space="0"/>
+              <w:bottom w:sz="4" w:val="single" w:color="CAD1DB" w:space="0"/>
+              <w:right w:sz="4" w:val="single" w:color="CAD1DB" w:space="0"/>
+            </w:tcBorders>
+            <w:shd w:fill="F7F9FB"/>
+          </w:tcPr>
+          <w:p>
+            <w:pPr>
+              <w:spacing w:after="0"/>
+            </w:pPr>
+            <w:r>
+              <w:rPr>
+                <w:rFonts w:ascii="Arial" w:hAnsi="Arial" w:eastAsia="Arial"/>
+                <w:color w:val="1F2937"/>
+                <w:sz w:val="15"/>
+              </w:rPr>
+              <w:t>47.3%</w:t>
+            </w:r>
+          </w:p>
+        </w:tc>
+        <w:tc>
+          <w:tcPr>
+            <w:tcW w:type="dxa" w:w="3326"/>
+            <w:vAlign w:val="center"/>
+            <w:tcMar>
+              <w:top w:w="85" w:type="dxa"/>
+              <w:start w:w="105" w:type="dxa"/>
+              <w:bottom w:w="85" w:type="dxa"/>
+              <w:end w:w="105" w:type="dxa"/>
+            </w:tcMar>
+            <w:tcBorders>
+              <w:top w:sz="4" w:val="single" w:color="CAD1DB" w:space="0"/>
+              <w:left w:sz="4" w:val="single" w:color="CAD1DB" w:space="0"/>
+              <w:bottom w:sz="4" w:val="single" w:color="CAD1DB" w:space="0"/>
+              <w:right w:sz="4" w:val="single" w:color="CAD1DB" w:space="0"/>
+            </w:tcBorders>
+            <w:shd w:fill="F7F9FB"/>
+          </w:tcPr>
+          <w:p>
+            <w:pPr>
+              <w:spacing w:after="0"/>
+            </w:pPr>
+            <w:r>
+              <w:rPr>
+                <w:rFonts w:ascii="Arial" w:hAnsi="Arial" w:eastAsia="Arial"/>
+                <w:color w:val="1F2937"/>
+                <w:sz w:val="15"/>
+              </w:rPr>
+              <w:t>Human group; close and speculative</w:t>
+            </w:r>
+          </w:p>
+        </w:tc>
+      </w:tr>
+      <w:tr>
+        <w:tc>
+          <w:tcPr>
+            <w:tcW w:type="dxa" w:w="3326"/>
+            <w:vAlign w:val="center"/>
+            <w:tcMar>
+              <w:top w:w="85" w:type="dxa"/>
+              <w:start w:w="105" w:type="dxa"/>
+              <w:bottom w:w="85" w:type="dxa"/>
+              <w:end w:w="105" w:type="dxa"/>
+            </w:tcMar>
+            <w:tcBorders>
+              <w:top w:sz="4" w:val="single" w:color="CAD1DB" w:space="0"/>
+              <w:left w:sz="4" w:val="single" w:color="CAD1DB" w:space="0"/>
+              <w:bottom w:sz="4" w:val="single" w:color="CAD1DB" w:space="0"/>
+              <w:right w:sz="4" w:val="single" w:color="CAD1DB" w:space="0"/>
+            </w:tcBorders>
+          </w:tcPr>
+          <w:p>
+            <w:pPr>
+              <w:spacing w:after="0"/>
+            </w:pPr>
+            <w:r>
+              <w:rPr>
+                <w:rFonts w:ascii="Arial" w:hAnsi="Arial" w:eastAsia="Arial"/>
+                <w:color w:val="1F2937"/>
+                <w:sz w:val="15"/>
+              </w:rPr>
+              <w:t>Medusa vs 20 armoured spear carriers</w:t>
+            </w:r>
+          </w:p>
+        </w:tc>
+        <w:tc>
+          <w:tcPr>
+            <w:tcW w:type="dxa" w:w="3326"/>
+            <w:vAlign w:val="center"/>
+            <w:tcMar>
+              <w:top w:w="85" w:type="dxa"/>
+              <w:start w:w="105" w:type="dxa"/>
+              <w:bottom w:w="85" w:type="dxa"/>
+              <w:end w:w="105" w:type="dxa"/>
+            </w:tcMar>
+            <w:tcBorders>
+              <w:top w:sz="4" w:val="single" w:color="CAD1DB" w:space="0"/>
+              <w:left w:sz="4" w:val="single" w:color="CAD1DB" w:space="0"/>
+              <w:bottom w:sz="4" w:val="single" w:color="CAD1DB" w:space="0"/>
+              <w:right w:sz="4" w:val="single" w:color="CAD1DB" w:space="0"/>
+            </w:tcBorders>
+          </w:tcPr>
+          <w:p>
+            <w:pPr>
+              <w:spacing w:after="0"/>
+            </w:pPr>
+            <w:r>
+              <w:rPr>
+                <w:rFonts w:ascii="Arial" w:hAnsi="Arial" w:eastAsia="Arial"/>
+                <w:color w:val="1F2937"/>
+                <w:sz w:val="15"/>
+              </w:rPr>
+              <w:t>6.1%</w:t>
+            </w:r>
+          </w:p>
+        </w:tc>
+        <w:tc>
+          <w:tcPr>
+            <w:tcW w:type="dxa" w:w="3326"/>
+            <w:vAlign w:val="center"/>
+            <w:tcMar>
+              <w:top w:w="85" w:type="dxa"/>
+              <w:start w:w="105" w:type="dxa"/>
+              <w:bottom w:w="85" w:type="dxa"/>
+              <w:end w:w="105" w:type="dxa"/>
+            </w:tcMar>
+            <w:tcBorders>
+              <w:top w:sz="4" w:val="single" w:color="CAD1DB" w:space="0"/>
+              <w:left w:sz="4" w:val="single" w:color="CAD1DB" w:space="0"/>
+              <w:bottom w:sz="4" w:val="single" w:color="CAD1DB" w:space="0"/>
+              <w:right w:sz="4" w:val="single" w:color="CAD1DB" w:space="0"/>
+            </w:tcBorders>
+          </w:tcPr>
+          <w:p>
+            <w:pPr>
+              <w:spacing w:after="0"/>
+            </w:pPr>
+            <w:r>
+              <w:rPr>
+                <w:rFonts w:ascii="Arial" w:hAnsi="Arial" w:eastAsia="Arial"/>
+                <w:color w:val="1F2937"/>
+                <w:sz w:val="15"/>
+              </w:rPr>
+              <w:t>Spear-carrier group</w:t>
+            </w:r>
+          </w:p>
+        </w:tc>
+      </w:tr>
+      <w:tr>
+        <w:tc>
+          <w:tcPr>
+            <w:tcW w:type="dxa" w:w="3326"/>
+            <w:vAlign w:val="center"/>
+            <w:tcMar>
+              <w:top w:w="85" w:type="dxa"/>
+              <w:start w:w="105" w:type="dxa"/>
+              <w:bottom w:w="85" w:type="dxa"/>
+              <w:end w:w="105" w:type="dxa"/>
+            </w:tcMar>
+            <w:tcBorders>
+              <w:top w:sz="4" w:val="single" w:color="CAD1DB" w:space="0"/>
+              <w:left w:sz="4" w:val="single" w:color="CAD1DB" w:space="0"/>
+              <w:bottom w:sz="4" w:val="single" w:color="CAD1DB" w:space="0"/>
+              <w:right w:sz="4" w:val="single" w:color="CAD1DB" w:space="0"/>
+            </w:tcBorders>
+            <w:shd w:fill="F7F9FB"/>
+          </w:tcPr>
+          <w:p>
+            <w:pPr>
+              <w:spacing w:after="0"/>
+            </w:pPr>
+            <w:r>
+              <w:rPr>
+                <w:rFonts w:ascii="Arial" w:hAnsi="Arial" w:eastAsia="Arial"/>
+                <w:color w:val="1F2937"/>
+                <w:sz w:val="15"/>
+              </w:rPr>
+              <w:t>Charybdis abstraction vs 20 orcas</w:t>
+            </w:r>
+          </w:p>
+        </w:tc>
+        <w:tc>
+          <w:tcPr>
+            <w:tcW w:type="dxa" w:w="3326"/>
+            <w:vAlign w:val="center"/>
+            <w:tcMar>
+              <w:top w:w="85" w:type="dxa"/>
+              <w:start w:w="105" w:type="dxa"/>
+              <w:bottom w:w="85" w:type="dxa"/>
+              <w:end w:w="105" w:type="dxa"/>
+            </w:tcMar>
+            <w:tcBorders>
+              <w:top w:sz="4" w:val="single" w:color="CAD1DB" w:space="0"/>
+              <w:left w:sz="4" w:val="single" w:color="CAD1DB" w:space="0"/>
+              <w:bottom w:sz="4" w:val="single" w:color="CAD1DB" w:space="0"/>
+              <w:right w:sz="4" w:val="single" w:color="CAD1DB" w:space="0"/>
+            </w:tcBorders>
+            <w:shd w:fill="F7F9FB"/>
+          </w:tcPr>
+          <w:p>
+            <w:pPr>
+              <w:spacing w:after="0"/>
+            </w:pPr>
+            <w:r>
+              <w:rPr>
+                <w:rFonts w:ascii="Arial" w:hAnsi="Arial" w:eastAsia="Arial"/>
+                <w:color w:val="1F2937"/>
+                <w:sz w:val="15"/>
+              </w:rPr>
+              <w:t>63.9%</w:t>
+            </w:r>
+          </w:p>
+        </w:tc>
+        <w:tc>
+          <w:tcPr>
+            <w:tcW w:type="dxa" w:w="3326"/>
+            <w:vAlign w:val="center"/>
+            <w:tcMar>
+              <w:top w:w="85" w:type="dxa"/>
+              <w:start w:w="105" w:type="dxa"/>
+              <w:bottom w:w="85" w:type="dxa"/>
+              <w:end w:w="105" w:type="dxa"/>
+            </w:tcMar>
+            <w:tcBorders>
+              <w:top w:sz="4" w:val="single" w:color="CAD1DB" w:space="0"/>
+              <w:left w:sz="4" w:val="single" w:color="CAD1DB" w:space="0"/>
+              <w:bottom w:sz="4" w:val="single" w:color="CAD1DB" w:space="0"/>
+              <w:right w:sz="4" w:val="single" w:color="CAD1DB" w:space="0"/>
+            </w:tcBorders>
+            <w:shd w:fill="F7F9FB"/>
+          </w:tcPr>
+          <w:p>
+            <w:pPr>
+              <w:spacing w:after="0"/>
+            </w:pPr>
+            <w:r>
+              <w:rPr>
+                <w:rFonts w:ascii="Arial" w:hAnsi="Arial" w:eastAsia="Arial"/>
+                <w:color w:val="1F2937"/>
+                <w:sz w:val="15"/>
+              </w:rPr>
+              <w:t>Charybdis; hazard abstraction warning</w:t>
             </w:r>
           </w:p>
         </w:tc>
@@ -16587,6 +16637,187 @@
       <w:pPr>
         <w:spacing w:after="20"/>
       </w:pPr>
+    </w:p>
+    <w:p>
+      <w:pPr>
+        <w:keepLines w:val="0"/>
+        <w:spacing w:after="80" w:before="0" w:line="259" w:lineRule="auto"/>
+      </w:pPr>
+      <w:r>
+        <w:rPr>
+          <w:rFonts w:ascii="Arial" w:hAnsi="Arial" w:eastAsia="Arial"/>
+          <w:color w:val="1F2937"/>
+          <w:sz w:val="18"/>
+        </w:rPr>
+        <w:t>A coefficient change should be assessed across the whole set. A change that makes one meme answer feel better but damages unrelated archetypes is a regression, not an improvement.</w:t>
+      </w:r>
+    </w:p>
+    <w:p>
+      <w:pPr>
+        <w:pStyle w:val="Heading2"/>
+      </w:pPr>
+      <w:r>
+        <w:t>Appendix C. Public-beta release checklist</w:t>
+      </w:r>
+    </w:p>
+    <w:p>
+      <w:pPr>
+        <w:pStyle w:val="ListBullet"/>
+      </w:pPr>
+      <w:r>
+        <w:rPr>
+          <w:rFonts w:ascii="Arial" w:hAnsi="Arial" w:eastAsia="Arial"/>
+          <w:color w:val="1F2937"/>
+          <w:sz w:val="17"/>
+        </w:rPr>
+        <w:t>Confirm code and data licences.</w:t>
+      </w:r>
+    </w:p>
+    <w:p>
+      <w:pPr>
+        <w:pStyle w:val="ListBullet"/>
+      </w:pPr>
+      <w:r>
+        <w:rPr>
+          <w:rFonts w:ascii="Arial" w:hAnsi="Arial" w:eastAsia="Arial"/>
+          <w:color w:val="1F2937"/>
+          <w:sz w:val="17"/>
+        </w:rPr>
+        <w:t>[x] Add model and data version constants.</w:t>
+      </w:r>
+    </w:p>
+    <w:p>
+      <w:pPr>
+        <w:pStyle w:val="ListBullet"/>
+      </w:pPr>
+      <w:r>
+        <w:rPr>
+          <w:rFonts w:ascii="Arial" w:hAnsi="Arial" w:eastAsia="Arial"/>
+          <w:color w:val="1F2937"/>
+          <w:sz w:val="17"/>
+        </w:rPr>
+        <w:t>[x] Run schema validation, tests, typecheck and production build.</w:t>
+      </w:r>
+    </w:p>
+    <w:p>
+      <w:pPr>
+        <w:pStyle w:val="ListBullet"/>
+      </w:pPr>
+      <w:r>
+        <w:rPr>
+          <w:rFonts w:ascii="Arial" w:hAnsi="Arial" w:eastAsia="Arial"/>
+          <w:color w:val="1F2937"/>
+          <w:sz w:val="17"/>
+        </w:rPr>
+        <w:t>Complete keyboard, axe, VoiceOver/NVDA, Safari iOS and Firefox checks.</w:t>
+      </w:r>
+    </w:p>
+    <w:p>
+      <w:pPr>
+        <w:pStyle w:val="ListBullet"/>
+      </w:pPr>
+      <w:r>
+        <w:rPr>
+          <w:rFonts w:ascii="Arial" w:hAnsi="Arial" w:eastAsia="Arial"/>
+          <w:color w:val="1F2937"/>
+          <w:sz w:val="17"/>
+        </w:rPr>
+        <w:t>Replace or strengthen provenance for the most frequently used profiles.</w:t>
+      </w:r>
+    </w:p>
+    <w:p>
+      <w:pPr>
+        <w:pStyle w:val="ListBullet"/>
+      </w:pPr>
+      <w:r>
+        <w:rPr>
+          <w:rFonts w:ascii="Arial" w:hAnsi="Arial" w:eastAsia="Arial"/>
+          <w:color w:val="1F2937"/>
+          <w:sz w:val="17"/>
+        </w:rPr>
+        <w:t>Add privacy, methodology and contact/reporting pages.</w:t>
+      </w:r>
+    </w:p>
+    <w:p>
+      <w:pPr>
+        <w:pStyle w:val="ListBullet"/>
+      </w:pPr>
+      <w:r>
+        <w:rPr>
+          <w:rFonts w:ascii="Arial" w:hAnsi="Arial" w:eastAsia="Arial"/>
+          <w:color w:val="1F2937"/>
+          <w:sz w:val="17"/>
+        </w:rPr>
+        <w:t>Add Open Graph metadata and a default social preview.</w:t>
+      </w:r>
+    </w:p>
+    <w:p>
+      <w:pPr>
+        <w:pStyle w:val="ListBullet"/>
+      </w:pPr>
+      <w:r>
+        <w:rPr>
+          <w:rFonts w:ascii="Arial" w:hAnsi="Arial" w:eastAsia="Arial"/>
+          <w:color w:val="1F2937"/>
+          <w:sz w:val="17"/>
+        </w:rPr>
+        <w:t xml:space="preserve">Configure HTTPS, compression, cache headers and monitoring on </w:t>
+      </w:r>
+      <w:r>
+        <w:rPr>
+          <w:rFonts w:ascii="Courier New" w:hAnsi="Courier New" w:eastAsia="Courier New"/>
+          <w:color w:val="0B1220"/>
+          <w:sz w:val="17"/>
+        </w:rPr>
+        <w:t>samfa12.com</w:t>
+      </w:r>
+      <w:r>
+        <w:rPr>
+          <w:rFonts w:ascii="Arial" w:hAnsi="Arial" w:eastAsia="Arial"/>
+          <w:color w:val="1F2937"/>
+          <w:sz w:val="17"/>
+        </w:rPr>
+        <w:t>.</w:t>
+      </w:r>
+    </w:p>
+    <w:p>
+      <w:pPr>
+        <w:pStyle w:val="ListBullet"/>
+      </w:pPr>
+      <w:r>
+        <w:rPr>
+          <w:rFonts w:ascii="Arial" w:hAnsi="Arial" w:eastAsia="Arial"/>
+          <w:color w:val="1F2937"/>
+          <w:sz w:val="17"/>
+        </w:rPr>
+        <w:t>[x] Test copied share links from a clean browser profile.</w:t>
+      </w:r>
+    </w:p>
+    <w:p>
+      <w:pPr>
+        <w:pStyle w:val="ListBullet"/>
+      </w:pPr>
+      <w:r>
+        <w:rPr>
+          <w:rFonts w:ascii="Arial" w:hAnsi="Arial" w:eastAsia="Arial"/>
+          <w:color w:val="1F2937"/>
+          <w:sz w:val="17"/>
+        </w:rPr>
+        <w:t>Test PNG and JSON downloads on mobile and desktop.</w:t>
+      </w:r>
+    </w:p>
+    <w:p>
+      <w:pPr>
+        <w:pStyle w:val="ListBullet"/>
+      </w:pPr>
+      <w:r>
+        <w:rPr>
+          <w:rFonts w:ascii="Arial" w:hAnsi="Arial" w:eastAsia="Arial"/>
+          <w:color w:val="1F2937"/>
+          <w:sz w:val="17"/>
+        </w:rPr>
+        <w:t>Publish a changelog and retain the previous deploy for rollback.</w:t>
+      </w:r>
     </w:p>
     <w:sectPr>
       <w:headerReference w:type="default" r:id="rId9"/>
@@ -16645,7 +16876,7 @@
         <w:color w:val="596579"/>
         <w:sz w:val="15"/>
       </w:rPr>
-      <w:t>WHAT WOULD WIN · PRODUCT PLAN · v0.1</w:t>
+      <w:t>WHAT WOULD WIN · PRODUCT PLAN · v0.2</w:t>
     </w:r>
   </w:p>
 </w:hdr>

</xml_diff>

<commit_message>
Complete public release licensing audit
</commit_message>
<xml_diff>
--- a/docs/What_Would_Win_Product_Plan.docx
+++ b/docs/What_Would_Win_Product_Plan.docx
@@ -6599,7 +6599,7 @@
           <w:color w:val="1F2937"/>
           <w:sz w:val="18"/>
         </w:rPr>
-        <w:t>The prototype includes one orientation URL and confidence label per row. These references are enough for navigation during development but are not a production provenance system. Many orientation links point to broad reference pages; normalized scores were manually authored for model coverage.</w:t>
+        <w:t>The public-beta licensing audit covers all 134 profiles. Each record identifies its CC BY-SA 4.0 Wikipedia orientation link, states that no third-party prose or media is bundled, and separates externally oriented fields from original Samfa12-tech model assumptions and metadata. Automated tests require complete, non-overlapping coverage and reject unclassified external-source domains. This clears the redistribution-licensing gate but remains distinct from scientific validation: many links are broad reference pages, physical inputs remain approximate, and normalized scores are manually authored for model coverage.</w:t>
       </w:r>
     </w:p>
     <w:p>
@@ -12235,7 +12235,7 @@
           <w:color w:val="1F2937"/>
           <w:sz w:val="17"/>
         </w:rPr>
-        <w:t>5. Complete data-licence review and cultural-sensitivity review for cryptid composites.</w:t>
+        <w:t>5. Complete cultural-sensitivity review for cryptid composites; the repository-wide data-licence review is complete.</w:t>
       </w:r>
     </w:p>
     <w:p>
@@ -12271,7 +12271,7 @@
           <w:color w:val="1F2937"/>
           <w:sz w:val="17"/>
         </w:rPr>
-        <w:t>1. Replace single-row orientation URLs with per-field provenance records.</w:t>
+        <w:t>1. Replace broad orientation evidence with primary, expert-reviewed per-field scientific provenance.</w:t>
       </w:r>
     </w:p>
     <w:p>
@@ -12341,7 +12341,7 @@
           <w:color w:val="1F2937"/>
           <w:sz w:val="17"/>
         </w:rPr>
-        <w:t>6. Record licences for source datasets and do not redistribute restricted source content.</w:t>
+        <w:t>6. Preserve the completed licence classifications and reject restricted or unreviewed new source content.</w:t>
       </w:r>
     </w:p>
     <w:p>
@@ -14037,7 +14037,7 @@
           <w:color w:val="1F2937"/>
           <w:sz w:val="17"/>
         </w:rPr>
-        <w:t>3. expand expert-reviewed per-field provenance and complete data/licence review;</w:t>
+        <w:t>3. expand expert-reviewed scientific provenance while preserving the completed data/licence audit;</w:t>
       </w:r>
     </w:p>
     <w:p>
@@ -16670,7 +16670,7 @@
           <w:color w:val="1F2937"/>
           <w:sz w:val="17"/>
         </w:rPr>
-        <w:t>Confirm code and data licences.</w:t>
+        <w:t>[x] Confirm code and data licences.</w:t>
       </w:r>
     </w:p>
     <w:p>

</xml_diff>